<commit_message>
Updated Phase 2 contributions
Updated the contributions doc to better show who did what for the documents
</commit_message>
<xml_diff>
--- a/Phase 2/Documents/Phase 2 Contributions.docx
+++ b/Phase 2/Documents/Phase 2 Contributions.docx
@@ -6,6 +6,7 @@
       <w:pPr>
         <w:pStyle w:val="Heading"/>
         <w:rPr>
+          <w:rFonts w:hint="eastAsia"/>
           <w:i/>
           <w:iCs/>
           <w:sz w:val="44"/>
@@ -28,7 +29,7 @@
           <w:sz w:val="44"/>
           <w:szCs w:val="44"/>
         </w:rPr>
-        <w:t>3</w:t>
+        <w:t xml:space="preserve">3, </w:t>
       </w:r>
       <w:r>
         <w:rPr>
@@ -37,24 +38,12 @@
           <w:sz w:val="44"/>
           <w:szCs w:val="44"/>
         </w:rPr>
-        <w:t xml:space="preserve">, </w:t>
-      </w:r>
-      <w:r>
-        <w:rPr>
-          <w:i/>
-          <w:iCs/>
-          <w:sz w:val="44"/>
-          <w:szCs w:val="44"/>
-        </w:rPr>
         <w:t>Phase 2 Contribution</w:t>
       </w:r>
     </w:p>
     <w:p>
       <w:pPr>
         <w:pStyle w:val="BodyText"/>
-        <w:rPr>
-          <w:rFonts w:hint="eastAsia"/>
-        </w:rPr>
       </w:pPr>
       <w:r>
         <w:rPr>
@@ -175,8 +164,51 @@
         </w:rPr>
       </w:pPr>
       <w:r>
-        <w:t>Worked on Documents for Phase 2</w:t>
-      </w:r>
+        <w:t xml:space="preserve">Worked on </w:t>
+      </w:r>
+      <w:r>
+        <w:t>Documents for Phase 2</w:t>
+      </w:r>
+    </w:p>
+    <w:p>
+      <w:pPr>
+        <w:numPr>
+          <w:ilvl w:val="1"/>
+          <w:numId w:val="1"/>
+        </w:numPr>
+        <w:rPr>
+          <w:b/>
+          <w:bCs/>
+        </w:rPr>
+      </w:pPr>
+      <w:r>
+        <w:t>Majority of system design doc</w:t>
+      </w:r>
+    </w:p>
+    <w:p>
+      <w:pPr>
+        <w:numPr>
+          <w:ilvl w:val="1"/>
+          <w:numId w:val="1"/>
+        </w:numPr>
+        <w:rPr>
+          <w:b/>
+          <w:bCs/>
+        </w:rPr>
+      </w:pPr>
+      <w:proofErr w:type="gramStart"/>
+      <w:r>
+        <w:t>All of</w:t>
+      </w:r>
+      <w:proofErr w:type="gramEnd"/>
+      <w:r>
+        <w:t xml:space="preserve"> the grant </w:t>
+      </w:r>
+      <w:proofErr w:type="gramStart"/>
+      <w:r>
+        <w:t>chart</w:t>
+      </w:r>
+      <w:proofErr w:type="gramEnd"/>
     </w:p>
     <w:p>
       <w:pPr>
@@ -267,36 +299,15 @@
         </w:rPr>
       </w:pPr>
       <w:r>
-        <w:t>Began Working on Main Menu Scenery and Race Track Model</w:t>
-      </w:r>
-    </w:p>
-    <w:p>
-      <w:pPr>
-        <w:rPr>
-          <w:b/>
-          <w:bCs/>
-        </w:rPr>
-      </w:pPr>
-      <w:r>
-        <w:rPr>
-          <w:b/>
-          <w:bCs/>
-        </w:rPr>
-        <w:t>Tyler</w:t>
-      </w:r>
-      <w:r>
-        <w:rPr>
-          <w:b/>
-          <w:bCs/>
-        </w:rPr>
-        <w:t xml:space="preserve"> (API Connections)</w:t>
-      </w:r>
-      <w:r>
-        <w:rPr>
-          <w:b/>
-          <w:bCs/>
-        </w:rPr>
-        <w:t>:</w:t>
+        <w:t xml:space="preserve">Began Working on Main Menu Scenery and </w:t>
+      </w:r>
+      <w:proofErr w:type="gramStart"/>
+      <w:r>
+        <w:t>Race Track</w:t>
+      </w:r>
+      <w:proofErr w:type="gramEnd"/>
+      <w:r>
+        <w:t xml:space="preserve"> Model</w:t>
       </w:r>
     </w:p>
     <w:p>
@@ -305,9 +316,84 @@
           <w:ilvl w:val="0"/>
           <w:numId w:val="2"/>
         </w:numPr>
-      </w:pPr>
-      <w:r>
-        <w:t>Worked on initial Google and PlayFab based account systems</w:t>
+        <w:rPr>
+          <w:b/>
+          <w:bCs/>
+        </w:rPr>
+      </w:pPr>
+      <w:r>
+        <w:t xml:space="preserve">Worked on </w:t>
+      </w:r>
+      <w:r>
+        <w:t>Documents for Phase 2</w:t>
+      </w:r>
+    </w:p>
+    <w:p>
+      <w:pPr>
+        <w:numPr>
+          <w:ilvl w:val="1"/>
+          <w:numId w:val="2"/>
+        </w:numPr>
+        <w:rPr>
+          <w:b/>
+          <w:bCs/>
+        </w:rPr>
+      </w:pPr>
+      <w:r>
+        <w:t>A section</w:t>
+      </w:r>
+      <w:r>
+        <w:t xml:space="preserve"> of system design doc</w:t>
+      </w:r>
+    </w:p>
+    <w:p>
+      <w:pPr>
+        <w:numPr>
+          <w:ilvl w:val="1"/>
+          <w:numId w:val="2"/>
+        </w:numPr>
+        <w:rPr>
+          <w:b/>
+          <w:bCs/>
+        </w:rPr>
+      </w:pPr>
+      <w:r>
+        <w:t>All</w:t>
+      </w:r>
+      <w:r>
+        <w:t xml:space="preserve"> of </w:t>
+      </w:r>
+      <w:r>
+        <w:t>Milestone Chart</w:t>
+      </w:r>
+    </w:p>
+    <w:p>
+      <w:pPr>
+        <w:rPr>
+          <w:b/>
+          <w:bCs/>
+        </w:rPr>
+      </w:pPr>
+      <w:r>
+        <w:rPr>
+          <w:b/>
+          <w:bCs/>
+        </w:rPr>
+        <w:t>Tyler</w:t>
+      </w:r>
+      <w:r>
+        <w:rPr>
+          <w:b/>
+          <w:bCs/>
+        </w:rPr>
+        <w:t xml:space="preserve"> (API Connections)</w:t>
+      </w:r>
+      <w:r>
+        <w:rPr>
+          <w:b/>
+          <w:bCs/>
+        </w:rPr>
+        <w:t>:</w:t>
       </w:r>
     </w:p>
     <w:p>
@@ -318,7 +404,84 @@
         </w:numPr>
       </w:pPr>
       <w:r>
-        <w:t>Worked on Documents from Phase 2</w:t>
+        <w:t xml:space="preserve">Worked on initial Google and </w:t>
+      </w:r>
+      <w:proofErr w:type="spellStart"/>
+      <w:r>
+        <w:t>PlayFab</w:t>
+      </w:r>
+      <w:proofErr w:type="spellEnd"/>
+      <w:r>
+        <w:t xml:space="preserve"> based account systems</w:t>
+      </w:r>
+    </w:p>
+    <w:p>
+      <w:pPr>
+        <w:numPr>
+          <w:ilvl w:val="0"/>
+          <w:numId w:val="2"/>
+        </w:numPr>
+        <w:rPr>
+          <w:b/>
+          <w:bCs/>
+        </w:rPr>
+      </w:pPr>
+      <w:r>
+        <w:t xml:space="preserve">Worked on </w:t>
+      </w:r>
+      <w:r>
+        <w:t>Documents for Phase 2</w:t>
+      </w:r>
+    </w:p>
+    <w:p>
+      <w:pPr>
+        <w:numPr>
+          <w:ilvl w:val="1"/>
+          <w:numId w:val="2"/>
+        </w:numPr>
+        <w:rPr>
+          <w:b/>
+          <w:bCs/>
+        </w:rPr>
+      </w:pPr>
+      <w:r>
+        <w:t>A</w:t>
+      </w:r>
+      <w:r>
+        <w:t xml:space="preserve"> few</w:t>
+      </w:r>
+      <w:r>
+        <w:t xml:space="preserve"> section</w:t>
+      </w:r>
+      <w:r>
+        <w:t>s</w:t>
+      </w:r>
+      <w:r>
+        <w:t xml:space="preserve"> of system design doc</w:t>
+      </w:r>
+    </w:p>
+    <w:p>
+      <w:pPr>
+        <w:numPr>
+          <w:ilvl w:val="1"/>
+          <w:numId w:val="2"/>
+        </w:numPr>
+        <w:rPr>
+          <w:b/>
+          <w:bCs/>
+        </w:rPr>
+      </w:pPr>
+      <w:r>
+        <w:t>Majority</w:t>
+      </w:r>
+      <w:r>
+        <w:t xml:space="preserve"> of </w:t>
+      </w:r>
+      <w:r>
+        <w:t>Duration</w:t>
+      </w:r>
+      <w:r>
+        <w:t xml:space="preserve"> Chart</w:t>
       </w:r>
     </w:p>
     <w:p>
@@ -397,6 +560,58 @@
     </w:p>
     <w:p>
       <w:pPr>
+        <w:numPr>
+          <w:ilvl w:val="0"/>
+          <w:numId w:val="4"/>
+        </w:numPr>
+        <w:rPr>
+          <w:b/>
+          <w:bCs/>
+        </w:rPr>
+      </w:pPr>
+      <w:r>
+        <w:t xml:space="preserve">Worked on </w:t>
+      </w:r>
+      <w:r>
+        <w:t>Documents for Phase 2</w:t>
+      </w:r>
+    </w:p>
+    <w:p>
+      <w:pPr>
+        <w:numPr>
+          <w:ilvl w:val="1"/>
+          <w:numId w:val="4"/>
+        </w:numPr>
+        <w:rPr>
+          <w:b/>
+          <w:bCs/>
+        </w:rPr>
+      </w:pPr>
+      <w:r>
+        <w:t>A few sections of system design doc</w:t>
+      </w:r>
+    </w:p>
+    <w:p>
+      <w:pPr>
+        <w:numPr>
+          <w:ilvl w:val="1"/>
+          <w:numId w:val="4"/>
+        </w:numPr>
+        <w:rPr>
+          <w:b/>
+          <w:bCs/>
+        </w:rPr>
+      </w:pPr>
+      <w:r>
+        <w:lastRenderedPageBreak/>
+        <w:t>Half</w:t>
+      </w:r>
+      <w:r>
+        <w:t xml:space="preserve"> of Duration Chart</w:t>
+      </w:r>
+    </w:p>
+    <w:p>
+      <w:pPr>
         <w:rPr>
           <w:b/>
           <w:bCs/>
@@ -444,6 +659,39 @@
       </w:pPr>
       <w:r>
         <w:t>Created Login Interface</w:t>
+      </w:r>
+    </w:p>
+    <w:p>
+      <w:pPr>
+        <w:numPr>
+          <w:ilvl w:val="0"/>
+          <w:numId w:val="5"/>
+        </w:numPr>
+        <w:rPr>
+          <w:b/>
+          <w:bCs/>
+        </w:rPr>
+      </w:pPr>
+      <w:r>
+        <w:t xml:space="preserve">Worked on </w:t>
+      </w:r>
+      <w:r>
+        <w:t>Documents for Phase 2</w:t>
+      </w:r>
+    </w:p>
+    <w:p>
+      <w:pPr>
+        <w:numPr>
+          <w:ilvl w:val="1"/>
+          <w:numId w:val="5"/>
+        </w:numPr>
+        <w:rPr>
+          <w:b/>
+          <w:bCs/>
+        </w:rPr>
+      </w:pPr>
+      <w:r>
+        <w:t>A few sections of system design doc</w:t>
       </w:r>
     </w:p>
     <w:sectPr>
@@ -1760,6 +2008,7 @@
   <w:style w:type="character" w:default="1" w:styleId="DefaultParagraphFont">
     <w:name w:val="Default Paragraph Font"/>
     <w:uiPriority w:val="1"/>
+    <w:semiHidden/>
     <w:unhideWhenUsed/>
   </w:style>
   <w:style w:type="table" w:default="1" w:styleId="TableNormal">

</xml_diff>

<commit_message>
Update Phase 2 Contributions.docx
</commit_message>
<xml_diff>
--- a/Phase 2/Documents/Phase 2 Contributions.docx
+++ b/Phase 2/Documents/Phase 2 Contributions.docx
@@ -196,19 +196,9 @@
           <w:bCs/>
         </w:rPr>
       </w:pPr>
-      <w:proofErr w:type="gramStart"/>
-      <w:r>
-        <w:t>All of</w:t>
-      </w:r>
-      <w:proofErr w:type="gramEnd"/>
-      <w:r>
-        <w:t xml:space="preserve"> the grant </w:t>
-      </w:r>
-      <w:proofErr w:type="gramStart"/>
-      <w:r>
-        <w:t>chart</w:t>
-      </w:r>
-      <w:proofErr w:type="gramEnd"/>
+      <w:r>
+        <w:t>All of the grant chart</w:t>
+      </w:r>
     </w:p>
     <w:p>
       <w:pPr>
@@ -286,6 +276,9 @@
       <w:r>
         <w:t>Created Main Menu Interface</w:t>
       </w:r>
+      <w:r>
+        <w:t xml:space="preserve"> (Buttons &amp; Text)</w:t>
+      </w:r>
     </w:p>
     <w:p>
       <w:pPr>
@@ -299,15 +292,7 @@
         </w:rPr>
       </w:pPr>
       <w:r>
-        <w:t xml:space="preserve">Began Working on Main Menu Scenery and </w:t>
-      </w:r>
-      <w:proofErr w:type="gramStart"/>
-      <w:r>
-        <w:t>Race Track</w:t>
-      </w:r>
-      <w:proofErr w:type="gramEnd"/>
-      <w:r>
-        <w:t xml:space="preserve"> Model</w:t>
+        <w:t>Began Working on Main Menu Scenery and Race Track Model</w:t>
       </w:r>
     </w:p>
     <w:p>
@@ -340,10 +325,7 @@
         </w:rPr>
       </w:pPr>
       <w:r>
-        <w:t>A section</w:t>
-      </w:r>
-      <w:r>
-        <w:t xml:space="preserve"> of system design doc</w:t>
+        <w:t>A section of system design doc</w:t>
       </w:r>
     </w:p>
     <w:p>
@@ -358,13 +340,7 @@
         </w:rPr>
       </w:pPr>
       <w:r>
-        <w:t>All</w:t>
-      </w:r>
-      <w:r>
-        <w:t xml:space="preserve"> of </w:t>
-      </w:r>
-      <w:r>
-        <w:t>Milestone Chart</w:t>
+        <w:t>All of Milestone Chart</w:t>
       </w:r>
     </w:p>
     <w:p>
@@ -445,19 +421,7 @@
         </w:rPr>
       </w:pPr>
       <w:r>
-        <w:t>A</w:t>
-      </w:r>
-      <w:r>
-        <w:t xml:space="preserve"> few</w:t>
-      </w:r>
-      <w:r>
-        <w:t xml:space="preserve"> section</w:t>
-      </w:r>
-      <w:r>
-        <w:t>s</w:t>
-      </w:r>
-      <w:r>
-        <w:t xml:space="preserve"> of system design doc</w:t>
+        <w:t>A few sections of system design doc</w:t>
       </w:r>
     </w:p>
     <w:p>
@@ -472,16 +436,7 @@
         </w:rPr>
       </w:pPr>
       <w:r>
-        <w:t>Majority</w:t>
-      </w:r>
-      <w:r>
-        <w:t xml:space="preserve"> of </w:t>
-      </w:r>
-      <w:r>
-        <w:t>Duration</w:t>
-      </w:r>
-      <w:r>
-        <w:t xml:space="preserve"> Chart</w:t>
+        <w:t>Majority of Duration Chart</w:t>
       </w:r>
     </w:p>
     <w:p>
@@ -542,6 +497,9 @@
       <w:r>
         <w:t>Created Login System</w:t>
       </w:r>
+      <w:r>
+        <w:t xml:space="preserve"> (The Backend functions)</w:t>
+      </w:r>
     </w:p>
     <w:p>
       <w:pPr>
@@ -557,6 +515,12 @@
       <w:r>
         <w:t>Remade Login Interface</w:t>
       </w:r>
+      <w:r>
+        <w:t xml:space="preserve"> </w:t>
+      </w:r>
+      <w:r>
+        <w:t>(Buttons &amp; Text)</w:t>
+      </w:r>
     </w:p>
     <w:p>
       <w:pPr>
@@ -604,10 +568,7 @@
       </w:pPr>
       <w:r>
         <w:lastRenderedPageBreak/>
-        <w:t>Half</w:t>
-      </w:r>
-      <w:r>
-        <w:t xml:space="preserve"> of Duration Chart</w:t>
+        <w:t>Half of Duration Chart</w:t>
       </w:r>
     </w:p>
     <w:p>
@@ -659,6 +620,12 @@
       </w:pPr>
       <w:r>
         <w:t>Created Login Interface</w:t>
+      </w:r>
+      <w:r>
+        <w:t xml:space="preserve"> </w:t>
+      </w:r>
+      <w:r>
+        <w:t>(Buttons &amp; Text)</w:t>
       </w:r>
     </w:p>
     <w:p>

</xml_diff>